<commit_message>
Sīki labojumi un uzlabojumi
- Skaņas iestatījumi (mūzika, efekti un skaļums) vienā blokā gan sākumlapā, gan spēles pauzē.
- Dalīšanās ar rezultātu tagad strādā Telegram iekšienē, pārlūkā un ar kopēšanu kā rezervi.
- Profilā pirkšanas poga bez atslēgas, izvēlētos skinus iezīmē rāmis, tekstam vienota ēna.
- Bots pilnībā latviski; izlabota gramatika visās trīs valodās.
- README pārrakstīts latviski: pareizās tehnoloģijas, lietošanas instrukcija un izstrādes sadaļa; izlabota arī dokumentācija.
</commit_message>
<xml_diff>
--- a/docs/kludu-testesana/Kludu_testesanas_protokols.docx
+++ b/docs/kludu-testesana/Kludu_testesanas_protokols.docx
@@ -334,12 +334,12 @@
     </w:p>
     <w:p>
       <w:r>
-        <w:t>• administrācijas izaicinājuma formas validācija (CH-03) un datumu apstrāde;</w:t>
+        <w:t>• administrācijas paneļa izaicinājuma formas validācija (CH-03) un datumu apstrāde;</w:t>
       </w:r>
     </w:p>
     <w:p>
       <w:r>
-        <w:t>• admina darbību kļūdu ziņojumi (ADM-01, ADM-02);</w:t>
+        <w:t>• administratora darbību kļūdu ziņojumi (ADM-01, ADM-02);</w:t>
       </w:r>
     </w:p>
     <w:p>
@@ -380,7 +380,7 @@
     </w:p>
     <w:p>
       <w:r>
-        <w:t>Firestore emulators ir Java lietotne; Java 21 tiek uzstādīta projekta iekšienē ar `npm run setup:test-tools` (.tools/, gitignored), tāpēc vide ir atkārtojama arī pēc repozitorija jaunas klonēšanas.</w:t>
+        <w:t>Firestore emulators ir Java lietotne; Java 21 tiek uzstādīta projekta iekšienē ar `npm run setup:test-tools` (.tools/, gitignored), tāpēc vide ir atkārtojama arī pēc repozitorija noklonēšanas no jauna.</w:t>
       </w:r>
     </w:p>
     <w:tbl>
@@ -1403,7 +1403,7 @@
               <w:rPr>
                 <w:sz w:val="18"/>
               </w:rPr>
-              <w:t>Admina kļūdu ziņojumi (adminErrors.test.ts)</w:t>
+              <w:t>Administratora kļūdu ziņojumi (adminErrors.test.ts)</w:t>
             </w:r>
           </w:p>
         </w:tc>
@@ -1771,7 +1771,7 @@
     </w:p>
     <w:p>
       <w:r>
-        <w:t>Kļūdu ceļam (nevis tikai derīgiem datiem) veltīti 26 formas validācijas testi, 12 admina ziņojumu testi, 20 drošības noteikumu testi un lielākā daļa no 103 Cloud Functions testiem — kopā vairāk nekā 60 negatīvo scenāriju.</w:t>
+        <w:t>Kļūdu ceļam (nevis tikai derīgiem datiem) veltīti 26 formas validācijas testi, 12 administratora ziņojumu testi, 20 drošības noteikumu testi un lielākā daļa no 103 Cloud Functions testiem — kopā vairāk nekā 60 negatīvo scenāriju.</w:t>
       </w:r>
     </w:p>
     <w:p>
@@ -1798,7 +1798,7 @@
     </w:p>
     <w:p>
       <w:r>
-        <w:t>Testu kopa: src/features/challengeValidation.test.ts (npm test). Pārbauda administrācijas paneļa izaicinājuma formas validāciju. Kļūdas tiek pieteiktas pa laukiem, un tās bloķē saglabāšanu.</w:t>
+        <w:t>Testu kopa: src/features/challengeValidation.test.ts (npm test). Pārbauda administrācijas paneļa izaicinājuma formas validāciju. Kļūdas tiek norādītas pa laukiem, un tās bloķē saglabāšanu.</w:t>
       </w:r>
     </w:p>
     <w:tbl>
@@ -3246,7 +3246,7 @@
               <w:rPr>
                 <w:sz w:val="16"/>
               </w:rPr>
-              <w:t>validate.startInvalid (datums netiek pārritināts uz citu dienu)</w:t>
+              <w:t>validate.startInvalid (datums netiek pārbīdīts uz citu dienu)</w:t>
             </w:r>
           </w:p>
         </w:tc>
@@ -4042,7 +4042,7 @@
     </w:p>
     <w:p>
       <w:r>
-        <w:t>Testu kopa: challengeValidation.test.ts. JavaScript Date pārritina neeksistējošu dienu (31.02 → 3.03), tāpēc tiek pārbaudīts apgrieztais pārveidojums.</w:t>
+        <w:t>Testu kopa: challengeValidation.test.ts. JavaScript Date pārbīda neeksistējošu dienu (31.02 → 3.03), tāpēc tiek pārbaudīts apgrieztais pārveidojums.</w:t>
       </w:r>
     </w:p>
     <w:tbl>
@@ -4441,12 +4441,12 @@
         <w:rPr>
           <w:color w:val="1F3864"/>
         </w:rPr>
-        <w:t>5.3. Admina darbību kļūdu ziņojumi (ADM-01/ADM-02)</w:t>
+        <w:t>5.3. Administratora darbību kļūdu ziņojumi (ADM-01/ADM-02)</w:t>
       </w:r>
     </w:p>
     <w:p>
       <w:r>
-        <w:t>Testu kopa: src/features/adminErrors.test.ts (npm test). Pārbauda, ko administrators redz, kad izaicinājuma izveide, labošana vai dzēšana neizdodas. Nepareizs kartējums nav crashes, bet maldina lietotāju, tāpēc katrs kods ir piefiksēts.</w:t>
+        <w:t>Testu kopa: src/features/adminErrors.test.ts (npm test). Pārbauda, ko administrators redz, kad izaicinājuma izveide, labošana vai dzēšana neizdodas. Nepareizs kartējums nesabojā sistēmu, bet maldina lietotāju, tāpēc katrs kļūdas kods ir pārbaudīts ar testu.</w:t>
       </w:r>
     </w:p>
     <w:tbl>
@@ -8617,7 +8617,7 @@
               <w:rPr>
                 <w:sz w:val="17"/>
               </w:rPr>
-              <w:t>challengeValidation.ts imports bez .ts paplašinājuma</w:t>
+              <w:t>challengeValidation.ts importa ceļš bez .ts paplašinājuma</w:t>
             </w:r>
           </w:p>
         </w:tc>
@@ -9117,7 +9117,7 @@
               <w:rPr>
                 <w:sz w:val="17"/>
               </w:rPr>
-              <w:t>Klusa nospēle bez kļūdas konsolē, spēle darbojas</w:t>
+              <w:t>Skaņa tiek izlaista klusi, bez kļūdām konsolē; spēle darbojas</w:t>
             </w:r>
           </w:p>
         </w:tc>
@@ -9175,7 +9175,7 @@
               <w:rPr>
                 <w:sz w:val="17"/>
               </w:rPr>
-              <w:t>Admina paziņojums, kad funkcija nav izvietota (UI līmenis)</w:t>
+              <w:t>Administratora paziņojums, kad funkcija nav izvietota (UI līmenis)</w:t>
             </w:r>
           </w:p>
         </w:tc>
@@ -9240,7 +9240,7 @@
     </w:p>
     <w:p>
       <w:r>
-        <w:t>Testēšanas gaitā atrasti un laboti trīs defekti (KT-B-01…03): divi testēšanas infrastruktūrā, kas neļāva kļūdu testus palaist, un viens lietotājam redzams — "null" kā kļūdas teksts admina panelī.</w:t>
+        <w:t>Testēšanas gaitā atrasti un laboti trīs defekti (KT-B-01…03): divi testēšanas infrastruktūrā, kas neļāva kļūdu testus palaist, un viens lietotājam redzams — "null" kā kļūdas teksts administratora panelī.</w:t>
       </w:r>
     </w:p>
     <w:p>
@@ -9268,7 +9268,7 @@
           <w:rFonts w:ascii="Consolas" w:hAnsi="Consolas"/>
           <w:sz w:val="17"/>
         </w:rPr>
-        <w:t>npm test                                  # 89 testi (spēle + validācija + admina ziņojumi)</w:t>
+        <w:t>npm test                                  # 89 testi (spēle + validācija + administratora ziņojumi)</w:t>
       </w:r>
     </w:p>
     <w:p>
@@ -9316,7 +9316,7 @@
           <w:rFonts w:ascii="Consolas" w:hAnsi="Consolas"/>
           <w:sz w:val="17"/>
         </w:rPr>
-        <w:t>python3 docs/kludu-testesana/build.py     # šī dokumenta pārlāde (DOCX + MD)</w:t>
+        <w:t>python3 docs/kludu-testesana/build.py     # šī dokumenta pārģenerēšana (DOCX + MD)</w:t>
       </w:r>
     </w:p>
     <w:p>

</xml_diff>